<commit_message>
week 4 and 5
</commit_message>
<xml_diff>
--- a/Introductory Programming and Problem Solvoing/Week 3/Workshop 3.docx
+++ b/Introductory Programming and Problem Solvoing/Week 3/Workshop 3.docx
@@ -183,15 +183,13 @@
         </w:rPr>
         <w:t xml:space="preserve">True, </w:t>
       </w:r>
-      <w:proofErr w:type="gramStart"/>
       <w:r>
         <w:rPr>
           <w:sz w:val="36"/>
           <w:szCs w:val="36"/>
         </w:rPr>
-        <w:t>The</w:t>
-      </w:r>
-      <w:proofErr w:type="gramEnd"/>
+        <w:t>the</w:t>
+      </w:r>
       <w:r>
         <w:rPr>
           <w:sz w:val="36"/>
@@ -199,36 +197,55 @@
         </w:rPr>
         <w:t xml:space="preserve"> work done by one type of work can also be done by another type</w:t>
       </w:r>
-    </w:p>
-    <w:p>
-      <w:pPr>
-        <w:rPr>
-          <w:b/>
-          <w:bCs/>
-          <w:sz w:val="44"/>
-          <w:szCs w:val="44"/>
-        </w:rPr>
-      </w:pPr>
-    </w:p>
-    <w:p>
-      <w:pPr>
-        <w:rPr>
-          <w:b/>
-          <w:bCs/>
-          <w:sz w:val="44"/>
-          <w:szCs w:val="44"/>
-        </w:rPr>
-      </w:pPr>
-    </w:p>
-    <w:p>
-      <w:pPr>
-        <w:rPr>
-          <w:b/>
-          <w:bCs/>
-          <w:sz w:val="44"/>
-          <w:szCs w:val="44"/>
-        </w:rPr>
-      </w:pPr>
+      <w:r>
+        <w:rPr>
+          <w:sz w:val="36"/>
+          <w:szCs w:val="36"/>
+        </w:rPr>
+        <w:t xml:space="preserve"> because all types of </w:t>
+      </w:r>
+      <w:proofErr w:type="gramStart"/>
+      <w:r>
+        <w:rPr>
+          <w:sz w:val="36"/>
+          <w:szCs w:val="36"/>
+        </w:rPr>
+        <w:t>loop</w:t>
+      </w:r>
+      <w:proofErr w:type="gramEnd"/>
+      <w:r>
+        <w:rPr>
+          <w:sz w:val="36"/>
+          <w:szCs w:val="36"/>
+        </w:rPr>
+        <w:t xml:space="preserve"> fundamentally work the same way.</w:t>
+      </w:r>
+    </w:p>
+    <w:p>
+      <w:pPr>
+        <w:pStyle w:val="ListParagraph"/>
+        <w:ind w:left="1440"/>
+        <w:rPr>
+          <w:sz w:val="36"/>
+          <w:szCs w:val="36"/>
+        </w:rPr>
+      </w:pPr>
+      <w:r>
+        <w:rPr>
+          <w:sz w:val="36"/>
+          <w:szCs w:val="36"/>
+        </w:rPr>
+        <w:br/>
+        <w:t>If the loop condition is true the loop code block is executed and the control flow again move to the condition part.</w:t>
+      </w:r>
+      <w:r>
+        <w:rPr>
+          <w:sz w:val="36"/>
+          <w:szCs w:val="36"/>
+        </w:rPr>
+        <w:br/>
+        <w:t>If the loop condition is false, the loop terminates.</w:t>
+      </w:r>
     </w:p>
     <w:p>
       <w:pPr>
@@ -625,48 +642,30 @@
     </w:p>
     <w:p>
       <w:pPr>
-        <w:pStyle w:val="ListParagraph"/>
-        <w:ind w:firstLine="720"/>
-        <w:rPr>
-          <w:sz w:val="44"/>
-          <w:szCs w:val="44"/>
-        </w:rPr>
-      </w:pPr>
-    </w:p>
-    <w:p>
-      <w:pPr>
-        <w:pStyle w:val="ListParagraph"/>
-        <w:ind w:firstLine="720"/>
-        <w:rPr>
-          <w:sz w:val="44"/>
-          <w:szCs w:val="44"/>
-        </w:rPr>
-      </w:pPr>
-    </w:p>
-    <w:p>
-      <w:pPr>
-        <w:pStyle w:val="ListParagraph"/>
-        <w:ind w:firstLine="720"/>
-        <w:rPr>
-          <w:sz w:val="44"/>
-          <w:szCs w:val="44"/>
-        </w:rPr>
-      </w:pPr>
-    </w:p>
-    <w:p>
-      <w:pPr>
-        <w:pStyle w:val="ListParagraph"/>
-        <w:ind w:firstLine="720"/>
-        <w:rPr>
-          <w:sz w:val="44"/>
-          <w:szCs w:val="44"/>
-        </w:rPr>
-      </w:pPr>
-    </w:p>
-    <w:p>
-      <w:pPr>
-        <w:pStyle w:val="ListParagraph"/>
-        <w:ind w:firstLine="720"/>
+        <w:rPr>
+          <w:sz w:val="44"/>
+          <w:szCs w:val="44"/>
+        </w:rPr>
+      </w:pPr>
+    </w:p>
+    <w:p>
+      <w:pPr>
+        <w:rPr>
+          <w:sz w:val="44"/>
+          <w:szCs w:val="44"/>
+        </w:rPr>
+      </w:pPr>
+    </w:p>
+    <w:p>
+      <w:pPr>
+        <w:rPr>
+          <w:sz w:val="44"/>
+          <w:szCs w:val="44"/>
+        </w:rPr>
+      </w:pPr>
+    </w:p>
+    <w:p>
+      <w:pPr>
         <w:rPr>
           <w:sz w:val="44"/>
           <w:szCs w:val="44"/>
@@ -828,7 +827,6 @@
     </w:p>
     <w:p>
       <w:pPr>
-        <w:pStyle w:val="ListParagraph"/>
         <w:rPr>
           <w:sz w:val="44"/>
           <w:szCs w:val="44"/>
@@ -949,8 +947,8 @@
           <w:szCs w:val="44"/>
         </w:rPr>
         <w:drawing>
-          <wp:inline distT="0" distB="0" distL="0" distR="0" wp14:anchorId="7B990259" wp14:editId="6400B3A6">
-            <wp:extent cx="5718517" cy="3664494"/>
+          <wp:inline distT="0" distB="0" distL="0" distR="0" wp14:anchorId="7B990259" wp14:editId="3D3D273F">
+            <wp:extent cx="4994286" cy="3200400"/>
             <wp:effectExtent l="0" t="0" r="0" b="0"/>
             <wp:docPr id="3" name="Picture 3" descr="Text&#10;&#10;Description automatically generated"/>
             <wp:cNvGraphicFramePr>
@@ -972,7 +970,7 @@
                   <pic:spPr>
                     <a:xfrm>
                       <a:off x="0" y="0"/>
-                      <a:ext cx="5724847" cy="3668551"/>
+                      <a:ext cx="5009804" cy="3210344"/>
                     </a:xfrm>
                     <a:prstGeom prst="rect">
                       <a:avLst/>
@@ -984,6 +982,15 @@
           </wp:inline>
         </w:drawing>
       </w:r>
+    </w:p>
+    <w:p>
+      <w:pPr>
+        <w:ind w:left="360"/>
+        <w:rPr>
+          <w:sz w:val="44"/>
+          <w:szCs w:val="44"/>
+        </w:rPr>
+      </w:pPr>
     </w:p>
     <w:p>
       <w:pPr>
@@ -1680,15 +1687,6 @@
     <w:p>
       <w:pPr>
         <w:pStyle w:val="ListParagraph"/>
-        <w:rPr>
-          <w:sz w:val="44"/>
-          <w:szCs w:val="44"/>
-        </w:rPr>
-      </w:pPr>
-    </w:p>
-    <w:p>
-      <w:pPr>
-        <w:pStyle w:val="ListParagraph"/>
         <w:numPr>
           <w:ilvl w:val="0"/>
           <w:numId w:val="3"/>
@@ -1703,6 +1701,7 @@
           <w:sz w:val="44"/>
           <w:szCs w:val="44"/>
         </w:rPr>
+        <w:lastRenderedPageBreak/>
         <w:t>Patterns pyramids of 1,22,333…</w:t>
       </w:r>
     </w:p>
@@ -1814,6 +1813,15 @@
     <w:p>
       <w:pPr>
         <w:pStyle w:val="ListParagraph"/>
+        <w:rPr>
+          <w:sz w:val="44"/>
+          <w:szCs w:val="44"/>
+        </w:rPr>
+      </w:pPr>
+    </w:p>
+    <w:p>
+      <w:pPr>
+        <w:pStyle w:val="ListParagraph"/>
         <w:numPr>
           <w:ilvl w:val="0"/>
           <w:numId w:val="3"/>
@@ -2064,6 +2072,7 @@
       </w:pPr>
       <w:r>
         <w:rPr>
+          <w:noProof/>
           <w:sz w:val="44"/>
           <w:szCs w:val="44"/>
         </w:rPr>
@@ -2132,6 +2141,7 @@
       </w:pPr>
       <w:r>
         <w:rPr>
+          <w:noProof/>
           <w:sz w:val="44"/>
           <w:szCs w:val="44"/>
         </w:rPr>
@@ -2313,6 +2323,7 @@
       </w:pPr>
       <w:r>
         <w:rPr>
+          <w:noProof/>
           <w:sz w:val="44"/>
           <w:szCs w:val="44"/>
         </w:rPr>
@@ -2589,6 +2600,7 @@
       </w:pPr>
       <w:r>
         <w:rPr>
+          <w:noProof/>
           <w:sz w:val="44"/>
           <w:szCs w:val="44"/>
         </w:rPr>
@@ -2765,6 +2777,7 @@
       </w:pPr>
       <w:r>
         <w:rPr>
+          <w:noProof/>
           <w:sz w:val="32"/>
           <w:szCs w:val="32"/>
         </w:rPr>
@@ -2982,6 +2995,7 @@
       </w:pPr>
       <w:r>
         <w:rPr>
+          <w:noProof/>
           <w:sz w:val="32"/>
           <w:szCs w:val="32"/>
         </w:rPr>
@@ -3037,6 +3051,7 @@
       </w:r>
       <w:r>
         <w:rPr>
+          <w:noProof/>
           <w:sz w:val="32"/>
           <w:szCs w:val="32"/>
         </w:rPr>
@@ -3147,15 +3162,13 @@
         </w:rPr>
         <w:t xml:space="preserve">: The program (a) represents indefinite loop because the number of times the </w:t>
       </w:r>
-      <w:proofErr w:type="gramStart"/>
-      <w:r>
-        <w:rPr>
-          <w:sz w:val="32"/>
-          <w:szCs w:val="32"/>
-        </w:rPr>
-        <w:t>instructions</w:t>
-      </w:r>
-      <w:proofErr w:type="gramEnd"/>
+      <w:r>
+        <w:rPr>
+          <w:sz w:val="32"/>
+          <w:szCs w:val="32"/>
+        </w:rPr>
+        <w:t>instruction</w:t>
+      </w:r>
       <w:r>
         <w:rPr>
           <w:sz w:val="32"/>
@@ -3197,15 +3210,13 @@
           <w:szCs w:val="32"/>
         </w:rPr>
       </w:pPr>
-      <w:proofErr w:type="gramStart"/>
-      <w:r>
-        <w:rPr>
-          <w:sz w:val="32"/>
-          <w:szCs w:val="32"/>
-        </w:rPr>
-        <w:t>And,</w:t>
-      </w:r>
-      <w:proofErr w:type="gramEnd"/>
+      <w:r>
+        <w:rPr>
+          <w:sz w:val="32"/>
+          <w:szCs w:val="32"/>
+        </w:rPr>
+        <w:t>And</w:t>
+      </w:r>
       <w:r>
         <w:rPr>
           <w:sz w:val="32"/>
@@ -3387,351 +3398,1001 @@
     </w:p>
     <w:p>
       <w:pPr>
-        <w:rPr>
-          <w:sz w:val="32"/>
-          <w:szCs w:val="32"/>
-        </w:rPr>
-      </w:pPr>
-    </w:p>
-    <w:p>
-      <w:pPr>
-        <w:pStyle w:val="ListParagraph"/>
-        <w:ind w:left="1080"/>
-        <w:rPr>
-          <w:sz w:val="32"/>
-          <w:szCs w:val="32"/>
-        </w:rPr>
-      </w:pPr>
-    </w:p>
-    <w:p>
-      <w:pPr>
-        <w:pStyle w:val="ListParagraph"/>
-        <w:ind w:left="1080"/>
-        <w:rPr>
-          <w:sz w:val="32"/>
-          <w:szCs w:val="32"/>
-        </w:rPr>
-      </w:pPr>
-    </w:p>
-    <w:p>
-      <w:pPr>
-        <w:pStyle w:val="ListParagraph"/>
-        <w:ind w:left="1080"/>
-        <w:rPr>
-          <w:sz w:val="32"/>
-          <w:szCs w:val="32"/>
-        </w:rPr>
-      </w:pPr>
-    </w:p>
-    <w:p>
-      <w:pPr>
-        <w:pStyle w:val="ListParagraph"/>
-        <w:ind w:left="1080"/>
-        <w:rPr>
-          <w:sz w:val="32"/>
-          <w:szCs w:val="32"/>
-        </w:rPr>
-      </w:pPr>
-    </w:p>
-    <w:p>
-      <w:pPr>
-        <w:pStyle w:val="ListParagraph"/>
-        <w:ind w:left="1080"/>
-        <w:rPr>
-          <w:sz w:val="32"/>
-          <w:szCs w:val="32"/>
-        </w:rPr>
-      </w:pPr>
-    </w:p>
-    <w:p>
-      <w:pPr>
-        <w:pStyle w:val="ListParagraph"/>
-        <w:ind w:left="1080"/>
-        <w:rPr>
-          <w:sz w:val="32"/>
-          <w:szCs w:val="32"/>
-        </w:rPr>
-      </w:pPr>
-    </w:p>
-    <w:p>
-      <w:pPr>
-        <w:pStyle w:val="ListParagraph"/>
-        <w:ind w:left="1080"/>
-        <w:rPr>
-          <w:sz w:val="32"/>
-          <w:szCs w:val="32"/>
-        </w:rPr>
-      </w:pPr>
-    </w:p>
-    <w:p>
-      <w:pPr>
-        <w:pStyle w:val="ListParagraph"/>
-        <w:ind w:left="1080"/>
-        <w:rPr>
-          <w:sz w:val="32"/>
-          <w:szCs w:val="32"/>
-        </w:rPr>
-      </w:pPr>
-    </w:p>
-    <w:p>
-      <w:pPr>
-        <w:pStyle w:val="ListParagraph"/>
-        <w:ind w:left="1080"/>
-        <w:rPr>
-          <w:sz w:val="32"/>
-          <w:szCs w:val="32"/>
-        </w:rPr>
-      </w:pPr>
-    </w:p>
-    <w:p>
-      <w:pPr>
-        <w:pStyle w:val="ListParagraph"/>
-        <w:ind w:left="1080"/>
-        <w:rPr>
-          <w:sz w:val="32"/>
-          <w:szCs w:val="32"/>
-        </w:rPr>
-      </w:pPr>
-    </w:p>
-    <w:p>
-      <w:pPr>
-        <w:pStyle w:val="ListParagraph"/>
-        <w:ind w:left="1080"/>
-        <w:rPr>
-          <w:sz w:val="32"/>
-          <w:szCs w:val="32"/>
-        </w:rPr>
-      </w:pPr>
-    </w:p>
-    <w:p>
-      <w:pPr>
-        <w:pStyle w:val="ListParagraph"/>
-        <w:ind w:left="1080"/>
-        <w:rPr>
-          <w:sz w:val="32"/>
-          <w:szCs w:val="32"/>
-        </w:rPr>
-      </w:pPr>
-    </w:p>
-    <w:p>
-      <w:pPr>
-        <w:pStyle w:val="ListParagraph"/>
-        <w:ind w:left="1080"/>
-        <w:rPr>
-          <w:sz w:val="32"/>
-          <w:szCs w:val="32"/>
-        </w:rPr>
-      </w:pPr>
-    </w:p>
-    <w:p>
-      <w:pPr>
-        <w:pStyle w:val="ListParagraph"/>
-        <w:ind w:left="1080"/>
-        <w:rPr>
-          <w:sz w:val="32"/>
-          <w:szCs w:val="32"/>
-        </w:rPr>
-      </w:pPr>
-    </w:p>
-    <w:p>
-      <w:pPr>
-        <w:pStyle w:val="ListParagraph"/>
-        <w:ind w:left="1080"/>
-        <w:rPr>
-          <w:sz w:val="32"/>
-          <w:szCs w:val="32"/>
-        </w:rPr>
-      </w:pPr>
-    </w:p>
-    <w:p>
-      <w:pPr>
-        <w:pStyle w:val="ListParagraph"/>
-        <w:ind w:left="1080"/>
-        <w:rPr>
-          <w:sz w:val="32"/>
-          <w:szCs w:val="32"/>
-        </w:rPr>
-      </w:pPr>
-    </w:p>
-    <w:p>
-      <w:pPr>
-        <w:pStyle w:val="ListParagraph"/>
-        <w:ind w:left="1080"/>
-        <w:rPr>
-          <w:sz w:val="32"/>
-          <w:szCs w:val="32"/>
-        </w:rPr>
-      </w:pPr>
-    </w:p>
-    <w:p>
-      <w:pPr>
-        <w:pStyle w:val="ListParagraph"/>
-        <w:ind w:left="1080"/>
-        <w:rPr>
-          <w:sz w:val="32"/>
-          <w:szCs w:val="32"/>
-        </w:rPr>
-      </w:pPr>
-    </w:p>
-    <w:p>
-      <w:pPr>
-        <w:pStyle w:val="ListParagraph"/>
-        <w:ind w:left="1080"/>
-        <w:rPr>
-          <w:sz w:val="32"/>
-          <w:szCs w:val="32"/>
-        </w:rPr>
-      </w:pPr>
-    </w:p>
-    <w:p>
-      <w:pPr>
-        <w:pStyle w:val="ListParagraph"/>
-        <w:ind w:left="1080"/>
-        <w:rPr>
-          <w:sz w:val="32"/>
-          <w:szCs w:val="32"/>
-        </w:rPr>
-      </w:pPr>
-    </w:p>
-    <w:p>
-      <w:pPr>
-        <w:pStyle w:val="ListParagraph"/>
-        <w:ind w:left="1080"/>
-        <w:rPr>
-          <w:sz w:val="32"/>
-          <w:szCs w:val="32"/>
-        </w:rPr>
-      </w:pPr>
-    </w:p>
-    <w:p>
-      <w:pPr>
-        <w:pStyle w:val="ListParagraph"/>
-        <w:ind w:left="1080"/>
-        <w:rPr>
-          <w:sz w:val="32"/>
-          <w:szCs w:val="32"/>
-        </w:rPr>
-      </w:pPr>
-    </w:p>
-    <w:p>
-      <w:pPr>
-        <w:pStyle w:val="ListParagraph"/>
-        <w:ind w:left="1080"/>
-        <w:rPr>
-          <w:sz w:val="32"/>
-          <w:szCs w:val="32"/>
-        </w:rPr>
-      </w:pPr>
-    </w:p>
-    <w:p>
-      <w:pPr>
-        <w:pStyle w:val="ListParagraph"/>
-        <w:ind w:left="1080"/>
-        <w:rPr>
-          <w:sz w:val="32"/>
-          <w:szCs w:val="32"/>
-        </w:rPr>
-      </w:pPr>
-    </w:p>
-    <w:p>
-      <w:pPr>
-        <w:pStyle w:val="ListParagraph"/>
-        <w:ind w:left="1080"/>
-        <w:rPr>
-          <w:sz w:val="32"/>
-          <w:szCs w:val="32"/>
-        </w:rPr>
-      </w:pPr>
-    </w:p>
-    <w:p>
-      <w:pPr>
-        <w:pStyle w:val="ListParagraph"/>
-        <w:ind w:left="1080"/>
-        <w:rPr>
-          <w:sz w:val="32"/>
-          <w:szCs w:val="32"/>
-        </w:rPr>
-      </w:pPr>
-    </w:p>
-    <w:p>
-      <w:pPr>
-        <w:pStyle w:val="ListParagraph"/>
-        <w:ind w:left="1080"/>
-        <w:rPr>
-          <w:sz w:val="32"/>
-          <w:szCs w:val="32"/>
-        </w:rPr>
-      </w:pPr>
-    </w:p>
-    <w:p>
-      <w:pPr>
-        <w:pStyle w:val="ListParagraph"/>
-        <w:ind w:left="1080"/>
-        <w:rPr>
-          <w:sz w:val="32"/>
-          <w:szCs w:val="32"/>
-        </w:rPr>
-      </w:pPr>
-    </w:p>
-    <w:p>
-      <w:pPr>
-        <w:pStyle w:val="ListParagraph"/>
-        <w:ind w:left="1080"/>
-        <w:rPr>
-          <w:sz w:val="32"/>
-          <w:szCs w:val="32"/>
-        </w:rPr>
-      </w:pPr>
-    </w:p>
-    <w:p>
-      <w:pPr>
-        <w:pStyle w:val="ListParagraph"/>
-        <w:ind w:left="1080"/>
-        <w:rPr>
-          <w:sz w:val="32"/>
-          <w:szCs w:val="32"/>
-        </w:rPr>
-      </w:pPr>
-    </w:p>
-    <w:p>
-      <w:pPr>
-        <w:pStyle w:val="ListParagraph"/>
-        <w:ind w:left="1080"/>
-        <w:rPr>
-          <w:sz w:val="32"/>
-          <w:szCs w:val="32"/>
-        </w:rPr>
-      </w:pPr>
-    </w:p>
-    <w:p>
-      <w:pPr>
-        <w:pStyle w:val="ListParagraph"/>
-        <w:ind w:left="1080"/>
-        <w:rPr>
-          <w:sz w:val="32"/>
-          <w:szCs w:val="32"/>
-        </w:rPr>
-      </w:pPr>
-    </w:p>
-    <w:p>
-      <w:pPr>
-        <w:pStyle w:val="ListParagraph"/>
-        <w:ind w:left="1080"/>
-        <w:rPr>
-          <w:sz w:val="32"/>
-          <w:szCs w:val="32"/>
-        </w:rPr>
-      </w:pPr>
-    </w:p>
-    <w:p>
-      <w:pPr>
-        <w:pStyle w:val="ListParagraph"/>
-        <w:ind w:left="1080"/>
-        <w:rPr>
-          <w:sz w:val="32"/>
-          <w:szCs w:val="32"/>
-        </w:rPr>
-      </w:pPr>
+        <w:pStyle w:val="ListParagraph"/>
+        <w:numPr>
+          <w:ilvl w:val="0"/>
+          <w:numId w:val="6"/>
+        </w:numPr>
+        <w:rPr>
+          <w:sz w:val="32"/>
+          <w:szCs w:val="32"/>
+        </w:rPr>
+      </w:pPr>
+      <w:r>
+        <w:rPr>
+          <w:sz w:val="32"/>
+          <w:szCs w:val="32"/>
+        </w:rPr>
+        <w:t>Change calculation</w:t>
+      </w:r>
+    </w:p>
+    <w:p>
+      <w:pPr>
+        <w:pStyle w:val="ListParagraph"/>
+        <w:ind w:left="1080"/>
+        <w:jc w:val="center"/>
+        <w:rPr>
+          <w:sz w:val="32"/>
+          <w:szCs w:val="32"/>
+        </w:rPr>
+      </w:pPr>
+      <w:r>
+        <w:rPr>
+          <w:sz w:val="32"/>
+          <w:szCs w:val="32"/>
+        </w:rPr>
+        <w:t>My main method</w:t>
+      </w:r>
+    </w:p>
+    <w:p>
+      <w:pPr>
+        <w:pStyle w:val="ListParagraph"/>
+        <w:ind w:left="1080"/>
+        <w:rPr>
+          <w:sz w:val="32"/>
+          <w:szCs w:val="32"/>
+        </w:rPr>
+      </w:pPr>
+      <w:r>
+        <w:rPr>
+          <w:sz w:val="32"/>
+          <w:szCs w:val="32"/>
+        </w:rPr>
+        <w:drawing>
+          <wp:anchor distT="0" distB="0" distL="114300" distR="114300" simplePos="0" relativeHeight="251663360" behindDoc="0" locked="0" layoutInCell="1" allowOverlap="1" wp14:anchorId="6FC34BD6" wp14:editId="0637BED2">
+            <wp:simplePos x="0" y="0"/>
+            <wp:positionH relativeFrom="column">
+              <wp:posOffset>311150</wp:posOffset>
+            </wp:positionH>
+            <wp:positionV relativeFrom="paragraph">
+              <wp:posOffset>3176</wp:posOffset>
+            </wp:positionV>
+            <wp:extent cx="5615877" cy="4559300"/>
+            <wp:effectExtent l="0" t="0" r="4445" b="0"/>
+            <wp:wrapNone/>
+            <wp:docPr id="22" name="Picture 22"/>
+            <wp:cNvGraphicFramePr>
+              <a:graphicFrameLocks xmlns:a="http://schemas.openxmlformats.org/drawingml/2006/main" noChangeAspect="1"/>
+            </wp:cNvGraphicFramePr>
+            <a:graphic xmlns:a="http://schemas.openxmlformats.org/drawingml/2006/main">
+              <a:graphicData uri="http://schemas.openxmlformats.org/drawingml/2006/picture">
+                <pic:pic xmlns:pic="http://schemas.openxmlformats.org/drawingml/2006/picture">
+                  <pic:nvPicPr>
+                    <pic:cNvPr id="1" name=""/>
+                    <pic:cNvPicPr/>
+                  </pic:nvPicPr>
+                  <pic:blipFill>
+                    <a:blip r:embed="rId26">
+                      <a:extLst>
+                        <a:ext uri="{28A0092B-C50C-407E-A947-70E740481C1C}">
+                          <a14:useLocalDpi xmlns:a14="http://schemas.microsoft.com/office/drawing/2010/main" val="0"/>
+                        </a:ext>
+                      </a:extLst>
+                    </a:blip>
+                    <a:stretch>
+                      <a:fillRect/>
+                    </a:stretch>
+                  </pic:blipFill>
+                  <pic:spPr>
+                    <a:xfrm>
+                      <a:off x="0" y="0"/>
+                      <a:ext cx="5619349" cy="4562119"/>
+                    </a:xfrm>
+                    <a:prstGeom prst="rect">
+                      <a:avLst/>
+                    </a:prstGeom>
+                  </pic:spPr>
+                </pic:pic>
+              </a:graphicData>
+            </a:graphic>
+            <wp14:sizeRelH relativeFrom="margin">
+              <wp14:pctWidth>0</wp14:pctWidth>
+            </wp14:sizeRelH>
+            <wp14:sizeRelV relativeFrom="margin">
+              <wp14:pctHeight>0</wp14:pctHeight>
+            </wp14:sizeRelV>
+          </wp:anchor>
+        </w:drawing>
+      </w:r>
+    </w:p>
+    <w:p>
+      <w:pPr>
+        <w:pStyle w:val="ListParagraph"/>
+        <w:ind w:left="1080"/>
+        <w:rPr>
+          <w:sz w:val="32"/>
+          <w:szCs w:val="32"/>
+        </w:rPr>
+      </w:pPr>
+    </w:p>
+    <w:p>
+      <w:pPr>
+        <w:pStyle w:val="ListParagraph"/>
+        <w:ind w:left="1080"/>
+        <w:rPr>
+          <w:sz w:val="32"/>
+          <w:szCs w:val="32"/>
+        </w:rPr>
+      </w:pPr>
+    </w:p>
+    <w:p>
+      <w:pPr>
+        <w:pStyle w:val="ListParagraph"/>
+        <w:ind w:left="1080"/>
+        <w:rPr>
+          <w:sz w:val="32"/>
+          <w:szCs w:val="32"/>
+        </w:rPr>
+      </w:pPr>
+    </w:p>
+    <w:p>
+      <w:pPr>
+        <w:pStyle w:val="ListParagraph"/>
+        <w:ind w:left="1080"/>
+        <w:rPr>
+          <w:sz w:val="32"/>
+          <w:szCs w:val="32"/>
+        </w:rPr>
+      </w:pPr>
+    </w:p>
+    <w:p>
+      <w:pPr>
+        <w:pStyle w:val="ListParagraph"/>
+        <w:ind w:left="1080"/>
+        <w:rPr>
+          <w:sz w:val="32"/>
+          <w:szCs w:val="32"/>
+        </w:rPr>
+      </w:pPr>
+    </w:p>
+    <w:p>
+      <w:pPr>
+        <w:pStyle w:val="ListParagraph"/>
+        <w:ind w:left="1080"/>
+        <w:rPr>
+          <w:sz w:val="32"/>
+          <w:szCs w:val="32"/>
+        </w:rPr>
+      </w:pPr>
+    </w:p>
+    <w:p>
+      <w:pPr>
+        <w:pStyle w:val="ListParagraph"/>
+        <w:ind w:left="1080"/>
+        <w:rPr>
+          <w:sz w:val="32"/>
+          <w:szCs w:val="32"/>
+        </w:rPr>
+      </w:pPr>
+    </w:p>
+    <w:p>
+      <w:pPr>
+        <w:pStyle w:val="ListParagraph"/>
+        <w:ind w:left="1080"/>
+        <w:rPr>
+          <w:sz w:val="32"/>
+          <w:szCs w:val="32"/>
+        </w:rPr>
+      </w:pPr>
+    </w:p>
+    <w:p>
+      <w:pPr>
+        <w:pStyle w:val="ListParagraph"/>
+        <w:ind w:left="1080"/>
+        <w:rPr>
+          <w:sz w:val="32"/>
+          <w:szCs w:val="32"/>
+        </w:rPr>
+      </w:pPr>
+    </w:p>
+    <w:p>
+      <w:pPr>
+        <w:pStyle w:val="ListParagraph"/>
+        <w:ind w:left="1080"/>
+        <w:rPr>
+          <w:sz w:val="32"/>
+          <w:szCs w:val="32"/>
+        </w:rPr>
+      </w:pPr>
+    </w:p>
+    <w:p>
+      <w:pPr>
+        <w:pStyle w:val="ListParagraph"/>
+        <w:ind w:left="1080"/>
+        <w:rPr>
+          <w:sz w:val="32"/>
+          <w:szCs w:val="32"/>
+        </w:rPr>
+      </w:pPr>
+    </w:p>
+    <w:p>
+      <w:pPr>
+        <w:pStyle w:val="ListParagraph"/>
+        <w:ind w:left="1080"/>
+        <w:rPr>
+          <w:sz w:val="32"/>
+          <w:szCs w:val="32"/>
+        </w:rPr>
+      </w:pPr>
+    </w:p>
+    <w:p>
+      <w:pPr>
+        <w:pStyle w:val="ListParagraph"/>
+        <w:ind w:left="1080"/>
+        <w:rPr>
+          <w:sz w:val="32"/>
+          <w:szCs w:val="32"/>
+        </w:rPr>
+      </w:pPr>
+    </w:p>
+    <w:p>
+      <w:pPr>
+        <w:pStyle w:val="ListParagraph"/>
+        <w:ind w:left="1080"/>
+        <w:rPr>
+          <w:sz w:val="32"/>
+          <w:szCs w:val="32"/>
+        </w:rPr>
+      </w:pPr>
+    </w:p>
+    <w:p>
+      <w:pPr>
+        <w:pStyle w:val="ListParagraph"/>
+        <w:ind w:left="1080"/>
+        <w:rPr>
+          <w:sz w:val="32"/>
+          <w:szCs w:val="32"/>
+        </w:rPr>
+      </w:pPr>
+    </w:p>
+    <w:p>
+      <w:pPr>
+        <w:pStyle w:val="ListParagraph"/>
+        <w:ind w:left="1080"/>
+        <w:jc w:val="center"/>
+        <w:rPr>
+          <w:sz w:val="32"/>
+          <w:szCs w:val="32"/>
+        </w:rPr>
+      </w:pPr>
+      <w:r>
+        <w:rPr>
+          <w:sz w:val="32"/>
+          <w:szCs w:val="32"/>
+        </w:rPr>
+        <w:t>Output:</w:t>
+      </w:r>
+    </w:p>
+    <w:p>
+      <w:pPr>
+        <w:jc w:val="center"/>
+        <w:rPr>
+          <w:sz w:val="32"/>
+          <w:szCs w:val="32"/>
+        </w:rPr>
+      </w:pPr>
+      <w:proofErr w:type="spellStart"/>
+      <w:r>
+        <w:rPr>
+          <w:sz w:val="32"/>
+          <w:szCs w:val="32"/>
+        </w:rPr>
+        <w:t>find</w:t>
+      </w:r>
+      <w:r>
+        <w:rPr>
+          <w:sz w:val="32"/>
+          <w:szCs w:val="32"/>
+        </w:rPr>
+        <w:t>Coin</w:t>
+      </w:r>
+      <w:r>
+        <w:rPr>
+          <w:sz w:val="32"/>
+          <w:szCs w:val="32"/>
+        </w:rPr>
+        <w:t>Combination</w:t>
+      </w:r>
+      <w:proofErr w:type="spellEnd"/>
+      <w:r>
+        <w:rPr>
+          <w:sz w:val="32"/>
+          <w:szCs w:val="32"/>
+        </w:rPr>
+        <w:t xml:space="preserve"> method:</w:t>
+      </w:r>
+    </w:p>
+    <w:p>
+      <w:pPr>
+        <w:pStyle w:val="ListParagraph"/>
+        <w:ind w:left="1080"/>
+        <w:jc w:val="center"/>
+        <w:rPr>
+          <w:sz w:val="32"/>
+          <w:szCs w:val="32"/>
+        </w:rPr>
+      </w:pPr>
+      <w:r>
+        <w:rPr>
+          <w:sz w:val="32"/>
+          <w:szCs w:val="32"/>
+        </w:rPr>
+        <w:drawing>
+          <wp:anchor distT="0" distB="0" distL="114300" distR="114300" simplePos="0" relativeHeight="251664384" behindDoc="0" locked="0" layoutInCell="1" allowOverlap="1" wp14:anchorId="7C9CDB29" wp14:editId="3736A3D8">
+            <wp:simplePos x="0" y="0"/>
+            <wp:positionH relativeFrom="column">
+              <wp:posOffset>323850</wp:posOffset>
+            </wp:positionH>
+            <wp:positionV relativeFrom="paragraph">
+              <wp:posOffset>5080</wp:posOffset>
+            </wp:positionV>
+            <wp:extent cx="5327650" cy="2967774"/>
+            <wp:effectExtent l="0" t="0" r="6350" b="4445"/>
+            <wp:wrapNone/>
+            <wp:docPr id="23" name="Picture 23" descr="Text&#10;&#10;Description automatically generated"/>
+            <wp:cNvGraphicFramePr>
+              <a:graphicFrameLocks xmlns:a="http://schemas.openxmlformats.org/drawingml/2006/main" noChangeAspect="1"/>
+            </wp:cNvGraphicFramePr>
+            <a:graphic xmlns:a="http://schemas.openxmlformats.org/drawingml/2006/main">
+              <a:graphicData uri="http://schemas.openxmlformats.org/drawingml/2006/picture">
+                <pic:pic xmlns:pic="http://schemas.openxmlformats.org/drawingml/2006/picture">
+                  <pic:nvPicPr>
+                    <pic:cNvPr id="23" name="Picture 23" descr="Text&#10;&#10;Description automatically generated"/>
+                    <pic:cNvPicPr/>
+                  </pic:nvPicPr>
+                  <pic:blipFill>
+                    <a:blip r:embed="rId27" cstate="print">
+                      <a:extLst>
+                        <a:ext uri="{28A0092B-C50C-407E-A947-70E740481C1C}">
+                          <a14:useLocalDpi xmlns:a14="http://schemas.microsoft.com/office/drawing/2010/main" val="0"/>
+                        </a:ext>
+                      </a:extLst>
+                    </a:blip>
+                    <a:stretch>
+                      <a:fillRect/>
+                    </a:stretch>
+                  </pic:blipFill>
+                  <pic:spPr>
+                    <a:xfrm>
+                      <a:off x="0" y="0"/>
+                      <a:ext cx="5333088" cy="2970803"/>
+                    </a:xfrm>
+                    <a:prstGeom prst="rect">
+                      <a:avLst/>
+                    </a:prstGeom>
+                  </pic:spPr>
+                </pic:pic>
+              </a:graphicData>
+            </a:graphic>
+            <wp14:sizeRelH relativeFrom="margin">
+              <wp14:pctWidth>0</wp14:pctWidth>
+            </wp14:sizeRelH>
+            <wp14:sizeRelV relativeFrom="margin">
+              <wp14:pctHeight>0</wp14:pctHeight>
+            </wp14:sizeRelV>
+          </wp:anchor>
+        </w:drawing>
+      </w:r>
+    </w:p>
+    <w:p>
+      <w:pPr>
+        <w:pStyle w:val="ListParagraph"/>
+        <w:ind w:left="1080"/>
+        <w:rPr>
+          <w:sz w:val="32"/>
+          <w:szCs w:val="32"/>
+        </w:rPr>
+      </w:pPr>
+    </w:p>
+    <w:p>
+      <w:pPr>
+        <w:pStyle w:val="ListParagraph"/>
+        <w:ind w:left="1080"/>
+        <w:rPr>
+          <w:sz w:val="32"/>
+          <w:szCs w:val="32"/>
+        </w:rPr>
+      </w:pPr>
+    </w:p>
+    <w:p>
+      <w:pPr>
+        <w:pStyle w:val="ListParagraph"/>
+        <w:ind w:left="1080"/>
+        <w:rPr>
+          <w:sz w:val="32"/>
+          <w:szCs w:val="32"/>
+        </w:rPr>
+      </w:pPr>
+    </w:p>
+    <w:p>
+      <w:pPr>
+        <w:pStyle w:val="ListParagraph"/>
+        <w:ind w:left="1080"/>
+        <w:rPr>
+          <w:sz w:val="32"/>
+          <w:szCs w:val="32"/>
+        </w:rPr>
+      </w:pPr>
+    </w:p>
+    <w:p>
+      <w:pPr>
+        <w:pStyle w:val="ListParagraph"/>
+        <w:ind w:left="1080"/>
+        <w:rPr>
+          <w:sz w:val="32"/>
+          <w:szCs w:val="32"/>
+        </w:rPr>
+      </w:pPr>
+    </w:p>
+    <w:p>
+      <w:pPr>
+        <w:pStyle w:val="ListParagraph"/>
+        <w:ind w:left="1080"/>
+        <w:rPr>
+          <w:sz w:val="32"/>
+          <w:szCs w:val="32"/>
+        </w:rPr>
+      </w:pPr>
+    </w:p>
+    <w:p>
+      <w:pPr>
+        <w:pStyle w:val="ListParagraph"/>
+        <w:ind w:left="1080"/>
+        <w:rPr>
+          <w:sz w:val="32"/>
+          <w:szCs w:val="32"/>
+        </w:rPr>
+      </w:pPr>
+    </w:p>
+    <w:p>
+      <w:pPr>
+        <w:pStyle w:val="ListParagraph"/>
+        <w:ind w:left="3960" w:firstLine="360"/>
+        <w:rPr>
+          <w:sz w:val="32"/>
+          <w:szCs w:val="32"/>
+        </w:rPr>
+      </w:pPr>
+      <w:r>
+        <w:rPr>
+          <w:sz w:val="32"/>
+          <w:szCs w:val="32"/>
+        </w:rPr>
+        <w:lastRenderedPageBreak/>
+        <w:t>Output:</w:t>
+      </w:r>
+    </w:p>
+    <w:p>
+      <w:pPr>
+        <w:pStyle w:val="ListParagraph"/>
+        <w:ind w:left="1080"/>
+        <w:rPr>
+          <w:sz w:val="32"/>
+          <w:szCs w:val="32"/>
+        </w:rPr>
+      </w:pPr>
+      <w:r>
+        <w:rPr>
+          <w:sz w:val="32"/>
+          <w:szCs w:val="32"/>
+        </w:rPr>
+        <w:drawing>
+          <wp:anchor distT="0" distB="0" distL="114300" distR="114300" simplePos="0" relativeHeight="251665408" behindDoc="0" locked="0" layoutInCell="1" allowOverlap="1" wp14:anchorId="51F7D4E2" wp14:editId="71ACD926">
+            <wp:simplePos x="0" y="0"/>
+            <wp:positionH relativeFrom="margin">
+              <wp:align>center</wp:align>
+            </wp:positionH>
+            <wp:positionV relativeFrom="paragraph">
+              <wp:posOffset>36830</wp:posOffset>
+            </wp:positionV>
+            <wp:extent cx="2978303" cy="2883048"/>
+            <wp:effectExtent l="0" t="0" r="0" b="0"/>
+            <wp:wrapNone/>
+            <wp:docPr id="24" name="Picture 24" descr="Text&#10;&#10;Description automatically generated"/>
+            <wp:cNvGraphicFramePr>
+              <a:graphicFrameLocks xmlns:a="http://schemas.openxmlformats.org/drawingml/2006/main" noChangeAspect="1"/>
+            </wp:cNvGraphicFramePr>
+            <a:graphic xmlns:a="http://schemas.openxmlformats.org/drawingml/2006/main">
+              <a:graphicData uri="http://schemas.openxmlformats.org/drawingml/2006/picture">
+                <pic:pic xmlns:pic="http://schemas.openxmlformats.org/drawingml/2006/picture">
+                  <pic:nvPicPr>
+                    <pic:cNvPr id="24" name="Picture 24" descr="Text&#10;&#10;Description automatically generated"/>
+                    <pic:cNvPicPr/>
+                  </pic:nvPicPr>
+                  <pic:blipFill>
+                    <a:blip r:embed="rId28">
+                      <a:extLst>
+                        <a:ext uri="{28A0092B-C50C-407E-A947-70E740481C1C}">
+                          <a14:useLocalDpi xmlns:a14="http://schemas.microsoft.com/office/drawing/2010/main" val="0"/>
+                        </a:ext>
+                      </a:extLst>
+                    </a:blip>
+                    <a:stretch>
+                      <a:fillRect/>
+                    </a:stretch>
+                  </pic:blipFill>
+                  <pic:spPr>
+                    <a:xfrm>
+                      <a:off x="0" y="0"/>
+                      <a:ext cx="2978303" cy="2883048"/>
+                    </a:xfrm>
+                    <a:prstGeom prst="rect">
+                      <a:avLst/>
+                    </a:prstGeom>
+                  </pic:spPr>
+                </pic:pic>
+              </a:graphicData>
+            </a:graphic>
+          </wp:anchor>
+        </w:drawing>
+      </w:r>
+    </w:p>
+    <w:p>
+      <w:pPr>
+        <w:pStyle w:val="ListParagraph"/>
+        <w:ind w:left="1080"/>
+        <w:rPr>
+          <w:sz w:val="32"/>
+          <w:szCs w:val="32"/>
+        </w:rPr>
+      </w:pPr>
+    </w:p>
+    <w:p>
+      <w:pPr>
+        <w:pStyle w:val="ListParagraph"/>
+        <w:ind w:left="1080"/>
+        <w:rPr>
+          <w:sz w:val="32"/>
+          <w:szCs w:val="32"/>
+        </w:rPr>
+      </w:pPr>
+    </w:p>
+    <w:p>
+      <w:pPr>
+        <w:pStyle w:val="ListParagraph"/>
+        <w:ind w:left="1080"/>
+        <w:rPr>
+          <w:sz w:val="32"/>
+          <w:szCs w:val="32"/>
+        </w:rPr>
+      </w:pPr>
+    </w:p>
+    <w:p>
+      <w:pPr>
+        <w:pStyle w:val="ListParagraph"/>
+        <w:ind w:left="1080"/>
+        <w:rPr>
+          <w:sz w:val="32"/>
+          <w:szCs w:val="32"/>
+        </w:rPr>
+      </w:pPr>
+    </w:p>
+    <w:p>
+      <w:pPr>
+        <w:pStyle w:val="ListParagraph"/>
+        <w:ind w:left="1080"/>
+        <w:rPr>
+          <w:sz w:val="32"/>
+          <w:szCs w:val="32"/>
+        </w:rPr>
+      </w:pPr>
+    </w:p>
+    <w:p>
+      <w:pPr>
+        <w:pStyle w:val="ListParagraph"/>
+        <w:ind w:left="1080"/>
+        <w:rPr>
+          <w:sz w:val="32"/>
+          <w:szCs w:val="32"/>
+        </w:rPr>
+      </w:pPr>
+    </w:p>
+    <w:p>
+      <w:pPr>
+        <w:pStyle w:val="ListParagraph"/>
+        <w:ind w:left="1080"/>
+        <w:rPr>
+          <w:sz w:val="32"/>
+          <w:szCs w:val="32"/>
+        </w:rPr>
+      </w:pPr>
+    </w:p>
+    <w:p>
+      <w:pPr>
+        <w:pStyle w:val="ListParagraph"/>
+        <w:ind w:left="1080"/>
+        <w:rPr>
+          <w:sz w:val="32"/>
+          <w:szCs w:val="32"/>
+        </w:rPr>
+      </w:pPr>
+    </w:p>
+    <w:p>
+      <w:pPr>
+        <w:pStyle w:val="ListParagraph"/>
+        <w:ind w:left="1080"/>
+        <w:rPr>
+          <w:sz w:val="32"/>
+          <w:szCs w:val="32"/>
+        </w:rPr>
+      </w:pPr>
+    </w:p>
+    <w:p>
+      <w:pPr>
+        <w:pStyle w:val="ListParagraph"/>
+        <w:ind w:left="1080"/>
+        <w:rPr>
+          <w:sz w:val="32"/>
+          <w:szCs w:val="32"/>
+        </w:rPr>
+      </w:pPr>
+    </w:p>
+    <w:p>
+      <w:pPr>
+        <w:pStyle w:val="ListParagraph"/>
+        <w:ind w:left="1080"/>
+        <w:rPr>
+          <w:sz w:val="32"/>
+          <w:szCs w:val="32"/>
+        </w:rPr>
+      </w:pPr>
+    </w:p>
+    <w:p>
+      <w:pPr>
+        <w:pStyle w:val="ListParagraph"/>
+        <w:ind w:left="1080"/>
+        <w:rPr>
+          <w:sz w:val="32"/>
+          <w:szCs w:val="32"/>
+        </w:rPr>
+      </w:pPr>
+    </w:p>
+    <w:p>
+      <w:pPr>
+        <w:pStyle w:val="ListParagraph"/>
+        <w:ind w:left="1080"/>
+        <w:rPr>
+          <w:sz w:val="32"/>
+          <w:szCs w:val="32"/>
+        </w:rPr>
+      </w:pPr>
+    </w:p>
+    <w:p>
+      <w:pPr>
+        <w:pStyle w:val="ListParagraph"/>
+        <w:ind w:left="1080"/>
+        <w:rPr>
+          <w:sz w:val="32"/>
+          <w:szCs w:val="32"/>
+        </w:rPr>
+      </w:pPr>
+    </w:p>
+    <w:p>
+      <w:pPr>
+        <w:pStyle w:val="ListParagraph"/>
+        <w:ind w:left="1080"/>
+        <w:rPr>
+          <w:sz w:val="32"/>
+          <w:szCs w:val="32"/>
+        </w:rPr>
+      </w:pPr>
+    </w:p>
+    <w:p>
+      <w:pPr>
+        <w:pStyle w:val="ListParagraph"/>
+        <w:ind w:left="1080"/>
+        <w:rPr>
+          <w:sz w:val="32"/>
+          <w:szCs w:val="32"/>
+        </w:rPr>
+      </w:pPr>
+    </w:p>
+    <w:p>
+      <w:pPr>
+        <w:pStyle w:val="ListParagraph"/>
+        <w:ind w:left="1080"/>
+        <w:rPr>
+          <w:sz w:val="32"/>
+          <w:szCs w:val="32"/>
+        </w:rPr>
+      </w:pPr>
+    </w:p>
+    <w:p>
+      <w:pPr>
+        <w:pStyle w:val="ListParagraph"/>
+        <w:ind w:left="1080"/>
+        <w:rPr>
+          <w:sz w:val="32"/>
+          <w:szCs w:val="32"/>
+        </w:rPr>
+      </w:pPr>
+    </w:p>
+    <w:p>
+      <w:pPr>
+        <w:pStyle w:val="ListParagraph"/>
+        <w:ind w:left="1080"/>
+        <w:rPr>
+          <w:sz w:val="32"/>
+          <w:szCs w:val="32"/>
+        </w:rPr>
+      </w:pPr>
+    </w:p>
+    <w:p>
+      <w:pPr>
+        <w:pStyle w:val="ListParagraph"/>
+        <w:ind w:left="1080"/>
+        <w:rPr>
+          <w:sz w:val="32"/>
+          <w:szCs w:val="32"/>
+        </w:rPr>
+      </w:pPr>
+    </w:p>
+    <w:p>
+      <w:pPr>
+        <w:pStyle w:val="ListParagraph"/>
+        <w:ind w:left="1080"/>
+        <w:rPr>
+          <w:sz w:val="32"/>
+          <w:szCs w:val="32"/>
+        </w:rPr>
+      </w:pPr>
+    </w:p>
+    <w:p>
+      <w:pPr>
+        <w:pStyle w:val="ListParagraph"/>
+        <w:ind w:left="1080"/>
+        <w:rPr>
+          <w:sz w:val="32"/>
+          <w:szCs w:val="32"/>
+        </w:rPr>
+      </w:pPr>
+    </w:p>
+    <w:p>
+      <w:pPr>
+        <w:pStyle w:val="ListParagraph"/>
+        <w:ind w:left="1080"/>
+        <w:rPr>
+          <w:sz w:val="32"/>
+          <w:szCs w:val="32"/>
+        </w:rPr>
+      </w:pPr>
+    </w:p>
+    <w:p>
+      <w:pPr>
+        <w:pStyle w:val="ListParagraph"/>
+        <w:ind w:left="1080"/>
+        <w:rPr>
+          <w:sz w:val="32"/>
+          <w:szCs w:val="32"/>
+        </w:rPr>
+      </w:pPr>
+    </w:p>
+    <w:p>
+      <w:pPr>
+        <w:pStyle w:val="ListParagraph"/>
+        <w:ind w:left="1080"/>
+        <w:rPr>
+          <w:sz w:val="32"/>
+          <w:szCs w:val="32"/>
+        </w:rPr>
+      </w:pPr>
+    </w:p>
+    <w:p>
+      <w:pPr>
+        <w:pStyle w:val="ListParagraph"/>
+        <w:ind w:left="1080"/>
+        <w:rPr>
+          <w:sz w:val="32"/>
+          <w:szCs w:val="32"/>
+        </w:rPr>
+      </w:pPr>
+    </w:p>
+    <w:p>
+      <w:pPr>
+        <w:pStyle w:val="ListParagraph"/>
+        <w:ind w:left="1080"/>
+        <w:rPr>
+          <w:sz w:val="32"/>
+          <w:szCs w:val="32"/>
+        </w:rPr>
+      </w:pPr>
+    </w:p>
+    <w:p>
+      <w:pPr>
+        <w:pStyle w:val="ListParagraph"/>
+        <w:ind w:left="1080"/>
+        <w:rPr>
+          <w:sz w:val="32"/>
+          <w:szCs w:val="32"/>
+        </w:rPr>
+      </w:pPr>
+    </w:p>
+    <w:p>
+      <w:pPr>
+        <w:pStyle w:val="ListParagraph"/>
+        <w:numPr>
+          <w:ilvl w:val="0"/>
+          <w:numId w:val="6"/>
+        </w:numPr>
+        <w:rPr>
+          <w:sz w:val="32"/>
+          <w:szCs w:val="32"/>
+        </w:rPr>
+      </w:pPr>
+      <w:r>
+        <w:rPr>
+          <w:sz w:val="32"/>
+          <w:szCs w:val="32"/>
+        </w:rPr>
+        <w:lastRenderedPageBreak/>
+        <w:t>Cosine of X using the given series:</w:t>
+      </w:r>
+    </w:p>
+    <w:p>
+      <w:pPr>
+        <w:ind w:left="720" w:firstLine="720"/>
+        <w:rPr>
+          <w:sz w:val="32"/>
+          <w:szCs w:val="32"/>
+        </w:rPr>
+      </w:pPr>
+      <w:r>
+        <w:rPr>
+          <w:sz w:val="32"/>
+          <w:szCs w:val="32"/>
+        </w:rPr>
+        <w:t>cos x = 1 - x</w:t>
+      </w:r>
+      <w:r>
+        <w:rPr>
+          <w:sz w:val="32"/>
+          <w:szCs w:val="32"/>
+          <w:vertAlign w:val="superscript"/>
+        </w:rPr>
+        <w:t>2</w:t>
+      </w:r>
+      <w:r>
+        <w:rPr>
+          <w:sz w:val="32"/>
+          <w:szCs w:val="32"/>
+        </w:rPr>
+        <w:t>/2! + x</w:t>
+      </w:r>
+      <w:r>
+        <w:rPr>
+          <w:sz w:val="32"/>
+          <w:szCs w:val="32"/>
+          <w:vertAlign w:val="superscript"/>
+        </w:rPr>
+        <w:t>4</w:t>
+      </w:r>
+      <w:r>
+        <w:rPr>
+          <w:sz w:val="32"/>
+          <w:szCs w:val="32"/>
+        </w:rPr>
+        <w:t>/4! - x</w:t>
+      </w:r>
+      <w:r>
+        <w:rPr>
+          <w:sz w:val="32"/>
+          <w:szCs w:val="32"/>
+          <w:vertAlign w:val="superscript"/>
+        </w:rPr>
+        <w:t>6</w:t>
+      </w:r>
+      <w:r>
+        <w:rPr>
+          <w:sz w:val="32"/>
+          <w:szCs w:val="32"/>
+        </w:rPr>
+        <w:t>/6! .....</w:t>
+      </w:r>
+    </w:p>
+    <w:p>
+      <w:pPr>
+        <w:rPr>
+          <w:sz w:val="32"/>
+          <w:szCs w:val="32"/>
+        </w:rPr>
+      </w:pPr>
+      <w:r>
+        <w:rPr>
+          <w:sz w:val="32"/>
+          <w:szCs w:val="32"/>
+        </w:rPr>
+        <w:t xml:space="preserve">     </w:t>
+      </w:r>
+      <w:r>
+        <w:rPr>
+          <w:sz w:val="32"/>
+          <w:szCs w:val="32"/>
+        </w:rPr>
+        <w:drawing>
+          <wp:inline distT="0" distB="0" distL="0" distR="0" wp14:anchorId="496F318D" wp14:editId="2DEC382C">
+            <wp:extent cx="5943600" cy="5116195"/>
+            <wp:effectExtent l="0" t="0" r="0" b="8255"/>
+            <wp:docPr id="25" name="Picture 25"/>
+            <wp:cNvGraphicFramePr>
+              <a:graphicFrameLocks xmlns:a="http://schemas.openxmlformats.org/drawingml/2006/main" noChangeAspect="1"/>
+            </wp:cNvGraphicFramePr>
+            <a:graphic xmlns:a="http://schemas.openxmlformats.org/drawingml/2006/main">
+              <a:graphicData uri="http://schemas.openxmlformats.org/drawingml/2006/picture">
+                <pic:pic xmlns:pic="http://schemas.openxmlformats.org/drawingml/2006/picture">
+                  <pic:nvPicPr>
+                    <pic:cNvPr id="1" name=""/>
+                    <pic:cNvPicPr/>
+                  </pic:nvPicPr>
+                  <pic:blipFill>
+                    <a:blip r:embed="rId29"/>
+                    <a:stretch>
+                      <a:fillRect/>
+                    </a:stretch>
+                  </pic:blipFill>
+                  <pic:spPr>
+                    <a:xfrm>
+                      <a:off x="0" y="0"/>
+                      <a:ext cx="5943600" cy="5116195"/>
+                    </a:xfrm>
+                    <a:prstGeom prst="rect">
+                      <a:avLst/>
+                    </a:prstGeom>
+                  </pic:spPr>
+                </pic:pic>
+              </a:graphicData>
+            </a:graphic>
+          </wp:inline>
+        </w:drawing>
+      </w:r>
+    </w:p>
+    <w:p>
+      <w:pPr>
+        <w:pStyle w:val="ListParagraph"/>
+        <w:ind w:left="1080"/>
+        <w:rPr>
+          <w:sz w:val="32"/>
+          <w:szCs w:val="32"/>
+        </w:rPr>
+      </w:pPr>
+      <w:r>
+        <w:rPr>
+          <w:sz w:val="32"/>
+          <w:szCs w:val="32"/>
+        </w:rPr>
+        <w:t xml:space="preserve">The Taylor series in the question is wrong. </w:t>
+      </w:r>
+      <w:r>
+        <w:rPr>
+          <w:sz w:val="32"/>
+          <w:szCs w:val="32"/>
+        </w:rPr>
+        <w:t>So,</w:t>
+      </w:r>
+      <w:r>
+        <w:rPr>
+          <w:sz w:val="32"/>
+          <w:szCs w:val="32"/>
+        </w:rPr>
+        <w:t xml:space="preserve"> implementing that gives wrong result.</w:t>
+      </w:r>
+      <w:r>
+        <w:rPr>
+          <w:sz w:val="32"/>
+          <w:szCs w:val="32"/>
+        </w:rPr>
+        <w:br/>
+        <w:t>Anyway, I have implemented the series in the question.</w:t>
+      </w:r>
     </w:p>
     <w:sectPr>
       <w:pgSz w:w="12240" w:h="15840"/>
@@ -4154,9 +4815,9 @@
     </w:lvl>
   </w:abstractNum>
   <w:abstractNum w:abstractNumId="4" w15:restartNumberingAfterBreak="0">
-    <w:nsid w:val="62B633ED"/>
+    <w:nsid w:val="4D66786A"/>
     <w:multiLevelType w:val="hybridMultilevel"/>
-    <w:tmpl w:val="1B561766"/>
+    <w:tmpl w:val="32FC433C"/>
     <w:lvl w:ilvl="0" w:tplc="0409000F">
       <w:start w:val="1"/>
       <w:numFmt w:val="decimal"/>
@@ -4242,11 +4903,100 @@
       </w:pPr>
     </w:lvl>
   </w:abstractNum>
+  <w:abstractNum w:abstractNumId="5" w15:restartNumberingAfterBreak="0">
+    <w:nsid w:val="62B633ED"/>
+    <w:multiLevelType w:val="hybridMultilevel"/>
+    <w:tmpl w:val="1B561766"/>
+    <w:lvl w:ilvl="0" w:tplc="0409000F">
+      <w:start w:val="1"/>
+      <w:numFmt w:val="decimal"/>
+      <w:lvlText w:val="%1."/>
+      <w:lvlJc w:val="left"/>
+      <w:pPr>
+        <w:ind w:left="720" w:hanging="360"/>
+      </w:pPr>
+      <w:rPr>
+        <w:rFonts w:hint="default"/>
+      </w:rPr>
+    </w:lvl>
+    <w:lvl w:ilvl="1" w:tplc="04090019">
+      <w:start w:val="1"/>
+      <w:numFmt w:val="lowerLetter"/>
+      <w:lvlText w:val="%2."/>
+      <w:lvlJc w:val="left"/>
+      <w:pPr>
+        <w:ind w:left="1440" w:hanging="360"/>
+      </w:pPr>
+    </w:lvl>
+    <w:lvl w:ilvl="2" w:tplc="0409001B" w:tentative="1">
+      <w:start w:val="1"/>
+      <w:numFmt w:val="lowerRoman"/>
+      <w:lvlText w:val="%3."/>
+      <w:lvlJc w:val="right"/>
+      <w:pPr>
+        <w:ind w:left="2160" w:hanging="180"/>
+      </w:pPr>
+    </w:lvl>
+    <w:lvl w:ilvl="3" w:tplc="0409000F" w:tentative="1">
+      <w:start w:val="1"/>
+      <w:numFmt w:val="decimal"/>
+      <w:lvlText w:val="%4."/>
+      <w:lvlJc w:val="left"/>
+      <w:pPr>
+        <w:ind w:left="2880" w:hanging="360"/>
+      </w:pPr>
+    </w:lvl>
+    <w:lvl w:ilvl="4" w:tplc="04090019" w:tentative="1">
+      <w:start w:val="1"/>
+      <w:numFmt w:val="lowerLetter"/>
+      <w:lvlText w:val="%5."/>
+      <w:lvlJc w:val="left"/>
+      <w:pPr>
+        <w:ind w:left="3600" w:hanging="360"/>
+      </w:pPr>
+    </w:lvl>
+    <w:lvl w:ilvl="5" w:tplc="0409001B" w:tentative="1">
+      <w:start w:val="1"/>
+      <w:numFmt w:val="lowerRoman"/>
+      <w:lvlText w:val="%6."/>
+      <w:lvlJc w:val="right"/>
+      <w:pPr>
+        <w:ind w:left="4320" w:hanging="180"/>
+      </w:pPr>
+    </w:lvl>
+    <w:lvl w:ilvl="6" w:tplc="0409000F" w:tentative="1">
+      <w:start w:val="1"/>
+      <w:numFmt w:val="decimal"/>
+      <w:lvlText w:val="%7."/>
+      <w:lvlJc w:val="left"/>
+      <w:pPr>
+        <w:ind w:left="5040" w:hanging="360"/>
+      </w:pPr>
+    </w:lvl>
+    <w:lvl w:ilvl="7" w:tplc="04090019" w:tentative="1">
+      <w:start w:val="1"/>
+      <w:numFmt w:val="lowerLetter"/>
+      <w:lvlText w:val="%8."/>
+      <w:lvlJc w:val="left"/>
+      <w:pPr>
+        <w:ind w:left="5760" w:hanging="360"/>
+      </w:pPr>
+    </w:lvl>
+    <w:lvl w:ilvl="8" w:tplc="0409001B" w:tentative="1">
+      <w:start w:val="1"/>
+      <w:numFmt w:val="lowerRoman"/>
+      <w:lvlText w:val="%9."/>
+      <w:lvlJc w:val="right"/>
+      <w:pPr>
+        <w:ind w:left="6480" w:hanging="180"/>
+      </w:pPr>
+    </w:lvl>
+  </w:abstractNum>
   <w:num w:numId="1" w16cid:durableId="1044912091">
     <w:abstractNumId w:val="0"/>
   </w:num>
   <w:num w:numId="2" w16cid:durableId="1349986129">
-    <w:abstractNumId w:val="4"/>
+    <w:abstractNumId w:val="5"/>
   </w:num>
   <w:num w:numId="3" w16cid:durableId="1734425752">
     <w:abstractNumId w:val="1"/>
@@ -4256,6 +5006,9 @@
   </w:num>
   <w:num w:numId="5" w16cid:durableId="1430662073">
     <w:abstractNumId w:val="3"/>
+  </w:num>
+  <w:num w:numId="6" w16cid:durableId="1962615877">
+    <w:abstractNumId w:val="4"/>
   </w:num>
 </w:numbering>
 </file>

</xml_diff>